<commit_message>
Berita acara: nama notulis baru, berkas per daerah, dokumen tanpa warna
- Pasangan notulis diganti sesuai susunan tim yang berlaku.
- Nama berkas Word diawali nama daerah supaya tidak saling tertimpa.
- Kunci API bersama juga terbaca oleh akun yang namanya memuat "jalan",
  bukan hanya yang user id-nya, dan selalu diambil ulang tiap sesi.
- Template: seluruh warna huruf dijadikan hitam, tabel Informasi Umum tidak
  lagi mengambang, paragraf kosong berlebih dibuang, halaman foto dimulai
  dengan page break, judul menempel pada tabelnya, baris judul tabel
  berulang antar halaman, serta bagian Catatan dan Tindak Lanjut hilang
  seluruhnya bila kosong.

Co-Authored-By: Claude Opus 5 <noreply@anthropic.com>
</commit_message>
<xml_diff>
--- a/assets/ba-template.docx
+++ b/assets/ba-template.docx
@@ -365,7 +365,7 @@
                                           <w:rPr>
                                             <w:rFonts w:ascii="Arial" w:eastAsia="Arial" w:hAnsi="Arial" w:cs="Arial"/>
                                             <w:b/>
-                                            <w:color w:val="FDC213"/>
+                                            <w:color w:val="000000"/>
                                             <w:sz w:val="14"/>
                                           </w:rPr>
                                           <w:t>51</w:t>
@@ -382,7 +382,7 @@
                                           <w:rPr>
                                             <w:rFonts w:ascii="Arial" w:eastAsia="Arial" w:hAnsi="Arial" w:cs="Arial"/>
                                             <w:b/>
-                                            <w:color w:val="FDC213"/>
+                                            <w:color w:val="000000"/>
                                             <w:sz w:val="14"/>
                                           </w:rPr>
                                           <w:t>104</w:t>
@@ -656,7 +656,7 @@
                                     <w:rPr>
                                       <w:rFonts w:ascii="Arial" w:eastAsia="Arial" w:hAnsi="Arial" w:cs="Arial"/>
                                       <w:b/>
-                                      <w:color w:val="FDC213"/>
+                                      <w:color w:val="000000"/>
                                       <w:sz w:val="14"/>
                                     </w:rPr>
                                     <w:t>51</w:t>
@@ -673,7 +673,7 @@
                                     <w:rPr>
                                       <w:rFonts w:ascii="Arial" w:eastAsia="Arial" w:hAnsi="Arial" w:cs="Arial"/>
                                       <w:b/>
-                                      <w:color w:val="FDC213"/>
+                                      <w:color w:val="000000"/>
                                       <w:sz w:val="14"/>
                                     </w:rPr>
                                     <w:t>104</w:t>
@@ -799,6 +799,7 @@
     </w:p>
     <w:p>
       <w:pPr>
+        <w:keepNext/>
         <w:numPr>
           <w:ilvl w:val="0"/>
           <w:numId w:val="1"/>
@@ -854,6 +855,7 @@
       </w:tblGrid>
       <w:tr>
         <w:trPr>
+          <w:cantSplit/>
           <w:trHeight w:val="590"/>
         </w:trPr>
         <w:tc>
@@ -917,7 +919,7 @@
             <w:r>
               <w:rPr>
                 <w:rFonts w:ascii="Cambria" w:eastAsia="Cambria" w:hAnsi="Cambria" w:cs="Cambria"/>
-                <w:color w:val="FFFF00"/>
+                <w:color w:val="000000"/>
                 <w:lang w:val="id-ID"/>
               </w:rPr>
               <w:t xml:space="preserve">{hariTanggal}</w:t>
@@ -927,6 +929,7 @@
       </w:tr>
       <w:tr>
         <w:trPr>
+          <w:cantSplit/>
           <w:trHeight w:val="570"/>
         </w:trPr>
         <w:tc>
@@ -1017,6 +1020,7 @@
       </w:tr>
       <w:tr>
         <w:trPr>
+          <w:cantSplit/>
           <w:trHeight w:val="578"/>
         </w:trPr>
         <w:tc>
@@ -1080,7 +1084,7 @@
             <w:r>
               <w:rPr>
                 <w:rFonts w:ascii="Cambria" w:eastAsia="Cambria" w:hAnsi="Cambria" w:cs="Cambria"/>
-                <w:color w:val="FFFF00"/>
+                <w:color w:val="000000"/>
                 <w:lang w:val="id-ID"/>
               </w:rPr>
               <w:t xml:space="preserve">{daerah}</w:t>
@@ -1090,6 +1094,7 @@
       </w:tr>
       <w:tr>
         <w:trPr>
+          <w:cantSplit/>
           <w:trHeight w:val="664"/>
         </w:trPr>
         <w:tc>
@@ -1147,14 +1152,14 @@
               <w:spacing w:line="360" w:lineRule="auto"/>
               <w:rPr>
                 <w:rFonts w:ascii="Cambria" w:eastAsia="Cambria" w:hAnsi="Cambria" w:cs="Cambria"/>
-                <w:color w:val="7030A0"/>
-                <w:lang w:val="id-ID"/>
-              </w:rPr>
-            </w:pPr>
-            <w:r>
-              <w:rPr>
-                <w:rFonts w:ascii="Cambria" w:eastAsia="Cambria" w:hAnsi="Cambria" w:cs="Cambria"/>
-                <w:color w:val="7030A0"/>
+                <w:color w:val="000000"/>
+                <w:lang w:val="id-ID"/>
+              </w:rPr>
+            </w:pPr>
+            <w:r>
+              <w:rPr>
+                <w:rFonts w:ascii="Cambria" w:eastAsia="Cambria" w:hAnsi="Cambria" w:cs="Cambria"/>
+                <w:color w:val="000000"/>
                 <w:lang w:val="id-ID"/>
               </w:rPr>
               <w:t xml:space="preserve">1. {notulis1}</w:t>
@@ -1165,14 +1170,14 @@
               <w:spacing w:line="360" w:lineRule="auto"/>
               <w:rPr>
                 <w:rFonts w:ascii="Cambria" w:eastAsia="Cambria" w:hAnsi="Cambria" w:cs="Cambria"/>
-                <w:color w:val="7030A0"/>
-                <w:lang w:val="id-ID"/>
-              </w:rPr>
-            </w:pPr>
-            <w:r>
-              <w:rPr>
-                <w:rFonts w:ascii="Cambria" w:eastAsia="Cambria" w:hAnsi="Cambria" w:cs="Cambria"/>
-                <w:color w:val="7030A0"/>
+                <w:color w:val="000000"/>
+                <w:lang w:val="id-ID"/>
+              </w:rPr>
+            </w:pPr>
+            <w:r>
+              <w:rPr>
+                <w:rFonts w:ascii="Cambria" w:eastAsia="Cambria" w:hAnsi="Cambria" w:cs="Cambria"/>
+                <w:color w:val="000000"/>
                 <w:lang w:val="id-ID"/>
               </w:rPr>
               <w:t>2.</w:t>
@@ -1182,7 +1187,7 @@
                 <w:rFonts w:ascii="Cambria" w:eastAsia="Cambria" w:hAnsi="Cambria" w:cs="Cambria"/>
                 <w:i/>
                 <w:iCs/>
-                <w:color w:val="7030A0"/>
+                <w:color w:val="000000"/>
                 <w:lang w:val="id-ID"/>
               </w:rPr>
               <w:t xml:space="preserve"> </w:t>
@@ -1190,7 +1195,7 @@
             <w:r>
               <w:rPr>
                 <w:rFonts w:ascii="Cambria" w:eastAsia="Cambria" w:hAnsi="Cambria" w:cs="Cambria"/>
-                <w:color w:val="7030A0"/>
+                <w:color w:val="000000"/>
                 <w:lang w:val="id-ID"/>
               </w:rPr>
               <w:t xml:space="preserve">{notulis2}</w:t>
@@ -1201,6 +1206,7 @@
     </w:tbl>
     <w:p>
       <w:pPr>
+        <w:keepNext/>
         <w:numPr>
           <w:ilvl w:val="0"/>
           <w:numId w:val="1"/>
@@ -1239,6 +1245,7 @@
     </w:p>
     <w:p>
       <w:pPr>
+        <w:keepNext/>
         <w:pBdr>
           <w:top w:val="nil"/>
           <w:left w:val="nil"/>
@@ -1270,6 +1277,7 @@
     </w:p>
     <w:p>
       <w:pPr>
+        <w:keepNext/>
         <w:pBdr>
           <w:top w:val="nil"/>
           <w:left w:val="nil"/>
@@ -1329,6 +1337,10 @@
         <w:gridCol w:w="1695"/>
       </w:tblGrid>
       <w:tr>
+        <w:trPr>
+          <w:cantSplit/>
+          <w:tblHeader/>
+        </w:trPr>
         <w:tc>
           <w:tcPr>
             <w:tcW w:w="1485" w:type="dxa"/>
@@ -1567,6 +1579,10 @@
         </w:tc>
       </w:tr>
       <w:tr>
+        <w:trPr>
+          <w:cantSplit/>
+          <w:tblHeader/>
+        </w:trPr>
         <w:tc>
           <w:tcPr>
             <w:tcW w:w="1485" w:type="dxa"/>
@@ -1823,6 +1839,9 @@
         </w:tc>
       </w:tr>
       <w:tr>
+        <w:trPr>
+          <w:cantSplit/>
+        </w:trPr>
         <w:tc>
           <w:tcPr>
             <w:tcW w:w="1485" w:type="dxa"/>
@@ -1840,16 +1859,16 @@
               <w:spacing w:before="120" w:after="200" w:line="360" w:lineRule="auto"/>
               <w:rPr>
                 <w:rFonts w:ascii="Cambria" w:eastAsia="Cambria" w:hAnsi="Cambria" w:cs="Cambria"/>
-                <w:color w:val="EE0000"/>
-                <w:sz w:val="20"/>
-                <w:szCs w:val="20"/>
-                <w:lang w:val="id-ID"/>
-              </w:rPr>
-            </w:pPr>
-            <w:r>
-              <w:rPr>
-                <w:rFonts w:ascii="Cambria" w:eastAsia="Cambria" w:hAnsi="Cambria" w:cs="Cambria"/>
-                <w:color w:val="EE0000"/>
+                <w:color w:val="000000"/>
+                <w:sz w:val="20"/>
+                <w:szCs w:val="20"/>
+                <w:lang w:val="id-ID"/>
+              </w:rPr>
+            </w:pPr>
+            <w:r>
+              <w:rPr>
+                <w:rFonts w:ascii="Cambria" w:eastAsia="Cambria" w:hAnsi="Cambria" w:cs="Cambria"/>
+                <w:color w:val="000000"/>
                 <w:sz w:val="20"/>
                 <w:szCs w:val="20"/>
                 <w:lang w:val="id-ID"/>
@@ -1878,18 +1897,18 @@
                 <w:rFonts w:ascii="Cambria" w:eastAsia="Cambria" w:hAnsi="Cambria" w:cs="Cambria"/>
                 <w:b/>
                 <w:bCs/>
-                <w:color w:val="EE0000"/>
-                <w:sz w:val="20"/>
-                <w:szCs w:val="20"/>
-                <w:lang w:val="id-ID"/>
-              </w:rPr>
-            </w:pPr>
-            <w:r>
-              <w:rPr>
-                <w:rFonts w:ascii="Cambria" w:eastAsia="Cambria" w:hAnsi="Cambria" w:cs="Cambria"/>
-                <w:b/>
-                <w:bCs/>
-                <w:color w:val="EE0000"/>
+                <w:color w:val="000000"/>
+                <w:sz w:val="20"/>
+                <w:szCs w:val="20"/>
+                <w:lang w:val="id-ID"/>
+              </w:rPr>
+            </w:pPr>
+            <w:r>
+              <w:rPr>
+                <w:rFonts w:ascii="Cambria" w:eastAsia="Cambria" w:hAnsi="Cambria" w:cs="Cambria"/>
+                <w:b/>
+                <w:bCs/>
+                <w:color w:val="000000"/>
                 <w:sz w:val="20"/>
                 <w:szCs w:val="20"/>
                 <w:lang w:val="id-ID"/>
@@ -1918,18 +1937,18 @@
                 <w:rFonts w:ascii="Cambria" w:eastAsia="Cambria" w:hAnsi="Cambria" w:cs="Cambria"/>
                 <w:b/>
                 <w:bCs/>
-                <w:color w:val="EE0000"/>
-                <w:sz w:val="20"/>
-                <w:szCs w:val="20"/>
-                <w:lang w:val="id-ID"/>
-              </w:rPr>
-            </w:pPr>
-            <w:r>
-              <w:rPr>
-                <w:rFonts w:ascii="Cambria" w:eastAsia="Cambria" w:hAnsi="Cambria" w:cs="Cambria"/>
-                <w:b/>
-                <w:bCs/>
-                <w:color w:val="EE0000"/>
+                <w:color w:val="000000"/>
+                <w:sz w:val="20"/>
+                <w:szCs w:val="20"/>
+                <w:lang w:val="id-ID"/>
+              </w:rPr>
+            </w:pPr>
+            <w:r>
+              <w:rPr>
+                <w:rFonts w:ascii="Cambria" w:eastAsia="Cambria" w:hAnsi="Cambria" w:cs="Cambria"/>
+                <w:b/>
+                <w:bCs/>
+                <w:color w:val="000000"/>
                 <w:sz w:val="20"/>
                 <w:szCs w:val="20"/>
                 <w:lang w:val="id-ID"/>
@@ -1958,18 +1977,18 @@
                 <w:rFonts w:ascii="Cambria" w:eastAsia="Cambria" w:hAnsi="Cambria" w:cs="Cambria"/>
                 <w:b/>
                 <w:bCs/>
-                <w:color w:val="EE0000"/>
-                <w:sz w:val="20"/>
-                <w:szCs w:val="20"/>
-                <w:lang w:val="id-ID"/>
-              </w:rPr>
-            </w:pPr>
-            <w:r>
-              <w:rPr>
-                <w:rFonts w:ascii="Cambria" w:eastAsia="Cambria" w:hAnsi="Cambria" w:cs="Cambria"/>
-                <w:b/>
-                <w:bCs/>
-                <w:color w:val="EE0000"/>
+                <w:color w:val="000000"/>
+                <w:sz w:val="20"/>
+                <w:szCs w:val="20"/>
+                <w:lang w:val="id-ID"/>
+              </w:rPr>
+            </w:pPr>
+            <w:r>
+              <w:rPr>
+                <w:rFonts w:ascii="Cambria" w:eastAsia="Cambria" w:hAnsi="Cambria" w:cs="Cambria"/>
+                <w:b/>
+                <w:bCs/>
+                <w:color w:val="000000"/>
                 <w:sz w:val="20"/>
                 <w:szCs w:val="20"/>
                 <w:lang w:val="id-ID"/>
@@ -1998,18 +2017,18 @@
                 <w:rFonts w:ascii="Cambria" w:eastAsia="Cambria" w:hAnsi="Cambria" w:cs="Cambria"/>
                 <w:b/>
                 <w:bCs/>
-                <w:color w:val="EE0000"/>
-                <w:sz w:val="20"/>
-                <w:szCs w:val="20"/>
-                <w:lang w:val="id-ID"/>
-              </w:rPr>
-            </w:pPr>
-            <w:r>
-              <w:rPr>
-                <w:rFonts w:ascii="Cambria" w:eastAsia="Cambria" w:hAnsi="Cambria" w:cs="Cambria"/>
-                <w:b/>
-                <w:bCs/>
-                <w:color w:val="EE0000"/>
+                <w:color w:val="000000"/>
+                <w:sz w:val="20"/>
+                <w:szCs w:val="20"/>
+                <w:lang w:val="id-ID"/>
+              </w:rPr>
+            </w:pPr>
+            <w:r>
+              <w:rPr>
+                <w:rFonts w:ascii="Cambria" w:eastAsia="Cambria" w:hAnsi="Cambria" w:cs="Cambria"/>
+                <w:b/>
+                <w:bCs/>
+                <w:color w:val="000000"/>
                 <w:sz w:val="20"/>
                 <w:szCs w:val="20"/>
                 <w:lang w:val="id-ID"/>
@@ -2038,18 +2057,18 @@
                 <w:rFonts w:ascii="Cambria" w:eastAsia="Cambria" w:hAnsi="Cambria" w:cs="Cambria"/>
                 <w:b/>
                 <w:bCs/>
-                <w:color w:val="EE0000"/>
-                <w:sz w:val="20"/>
-                <w:szCs w:val="20"/>
-                <w:lang w:val="id-ID"/>
-              </w:rPr>
-            </w:pPr>
-            <w:r>
-              <w:rPr>
-                <w:rFonts w:ascii="Cambria" w:eastAsia="Cambria" w:hAnsi="Cambria" w:cs="Cambria"/>
-                <w:b/>
-                <w:bCs/>
-                <w:color w:val="EE0000"/>
+                <w:color w:val="000000"/>
+                <w:sz w:val="20"/>
+                <w:szCs w:val="20"/>
+                <w:lang w:val="id-ID"/>
+              </w:rPr>
+            </w:pPr>
+            <w:r>
+              <w:rPr>
+                <w:rFonts w:ascii="Cambria" w:eastAsia="Cambria" w:hAnsi="Cambria" w:cs="Cambria"/>
+                <w:b/>
+                <w:bCs/>
+                <w:color w:val="000000"/>
                 <w:sz w:val="20"/>
                 <w:szCs w:val="20"/>
                 <w:lang w:val="id-ID"/>
@@ -2078,18 +2097,18 @@
                 <w:rFonts w:ascii="Cambria" w:eastAsia="Cambria" w:hAnsi="Cambria" w:cs="Cambria"/>
                 <w:b/>
                 <w:bCs/>
-                <w:color w:val="EE0000"/>
-                <w:sz w:val="20"/>
-                <w:szCs w:val="20"/>
-                <w:lang w:val="id-ID"/>
-              </w:rPr>
-            </w:pPr>
-            <w:r>
-              <w:rPr>
-                <w:rFonts w:ascii="Cambria" w:eastAsia="Cambria" w:hAnsi="Cambria" w:cs="Cambria"/>
-                <w:b/>
-                <w:bCs/>
-                <w:color w:val="EE0000"/>
+                <w:color w:val="000000"/>
+                <w:sz w:val="20"/>
+                <w:szCs w:val="20"/>
+                <w:lang w:val="id-ID"/>
+              </w:rPr>
+            </w:pPr>
+            <w:r>
+              <w:rPr>
+                <w:rFonts w:ascii="Cambria" w:eastAsia="Cambria" w:hAnsi="Cambria" w:cs="Cambria"/>
+                <w:b/>
+                <w:bCs/>
+                <w:color w:val="000000"/>
                 <w:sz w:val="20"/>
                 <w:szCs w:val="20"/>
                 <w:lang w:val="id-ID"/>
@@ -2122,6 +2141,7 @@
     </w:p>
     <w:p>
       <w:pPr>
+        <w:keepNext/>
         <w:pBdr>
           <w:top w:val="nil"/>
           <w:left w:val="nil"/>
@@ -2178,6 +2198,10 @@
         <w:gridCol w:w="1841"/>
       </w:tblGrid>
       <w:tr>
+        <w:trPr>
+          <w:cantSplit/>
+          <w:tblHeader/>
+        </w:trPr>
         <w:tc>
           <w:tcPr>
             <w:tcW w:w="1979" w:type="dxa"/>
@@ -2385,6 +2409,9 @@
         </w:tc>
       </w:tr>
       <w:tr>
+        <w:trPr>
+          <w:cantSplit/>
+        </w:trPr>
         <w:tc>
           <w:tcPr>
             <w:tcW w:w="1979" w:type="dxa"/>
@@ -2402,16 +2429,16 @@
               <w:spacing w:after="200" w:line="360" w:lineRule="auto"/>
               <w:rPr>
                 <w:rFonts w:ascii="Cambria" w:eastAsia="Cambria" w:hAnsi="Cambria" w:cs="Cambria"/>
-                <w:color w:val="EE0000"/>
-                <w:sz w:val="20"/>
-                <w:szCs w:val="20"/>
-                <w:lang w:val="id-ID"/>
-              </w:rPr>
-            </w:pPr>
-            <w:r>
-              <w:rPr>
-                <w:rFonts w:ascii="Cambria" w:eastAsia="Cambria" w:hAnsi="Cambria" w:cs="Cambria"/>
-                <w:color w:val="EE0000"/>
+                <w:color w:val="000000"/>
+                <w:sz w:val="20"/>
+                <w:szCs w:val="20"/>
+                <w:lang w:val="id-ID"/>
+              </w:rPr>
+            </w:pPr>
+            <w:r>
+              <w:rPr>
+                <w:rFonts w:ascii="Cambria" w:eastAsia="Cambria" w:hAnsi="Cambria" w:cs="Cambria"/>
+                <w:color w:val="000000"/>
                 <w:sz w:val="20"/>
                 <w:szCs w:val="20"/>
                 <w:lang w:val="id-ID"/>
@@ -2438,16 +2465,16 @@
               <w:jc w:val="center"/>
               <w:rPr>
                 <w:rFonts w:ascii="Cambria" w:eastAsia="Cambria" w:hAnsi="Cambria" w:cs="Cambria"/>
-                <w:color w:val="EE0000"/>
-                <w:sz w:val="20"/>
-                <w:szCs w:val="20"/>
-                <w:lang w:val="id-ID"/>
-              </w:rPr>
-            </w:pPr>
-            <w:r>
-              <w:rPr>
-                <w:rFonts w:ascii="Cambria" w:eastAsia="Cambria" w:hAnsi="Cambria" w:cs="Cambria"/>
-                <w:color w:val="EE0000"/>
+                <w:color w:val="000000"/>
+                <w:sz w:val="20"/>
+                <w:szCs w:val="20"/>
+                <w:lang w:val="id-ID"/>
+              </w:rPr>
+            </w:pPr>
+            <w:r>
+              <w:rPr>
+                <w:rFonts w:ascii="Cambria" w:eastAsia="Cambria" w:hAnsi="Cambria" w:cs="Cambria"/>
+                <w:color w:val="000000"/>
                 <w:sz w:val="20"/>
                 <w:szCs w:val="20"/>
                 <w:lang w:val="id-ID"/>
@@ -2474,16 +2501,16 @@
               <w:jc w:val="center"/>
               <w:rPr>
                 <w:rFonts w:ascii="Cambria" w:eastAsia="Cambria" w:hAnsi="Cambria" w:cs="Cambria"/>
-                <w:color w:val="EE0000"/>
-                <w:sz w:val="20"/>
-                <w:szCs w:val="20"/>
-                <w:lang w:val="id-ID"/>
-              </w:rPr>
-            </w:pPr>
-            <w:r>
-              <w:rPr>
-                <w:rFonts w:ascii="Cambria" w:eastAsia="Cambria" w:hAnsi="Cambria" w:cs="Cambria"/>
-                <w:color w:val="EE0000"/>
+                <w:color w:val="000000"/>
+                <w:sz w:val="20"/>
+                <w:szCs w:val="20"/>
+                <w:lang w:val="id-ID"/>
+              </w:rPr>
+            </w:pPr>
+            <w:r>
+              <w:rPr>
+                <w:rFonts w:ascii="Cambria" w:eastAsia="Cambria" w:hAnsi="Cambria" w:cs="Cambria"/>
+                <w:color w:val="000000"/>
                 <w:sz w:val="20"/>
                 <w:szCs w:val="20"/>
                 <w:lang w:val="id-ID"/>
@@ -2510,16 +2537,16 @@
               <w:jc w:val="center"/>
               <w:rPr>
                 <w:rFonts w:ascii="Cambria" w:eastAsia="Cambria" w:hAnsi="Cambria" w:cs="Cambria"/>
-                <w:color w:val="EE0000"/>
-                <w:sz w:val="20"/>
-                <w:szCs w:val="20"/>
-                <w:lang w:val="id-ID"/>
-              </w:rPr>
-            </w:pPr>
-            <w:r>
-              <w:rPr>
-                <w:rFonts w:ascii="Cambria" w:eastAsia="Cambria" w:hAnsi="Cambria" w:cs="Cambria"/>
-                <w:color w:val="EE0000"/>
+                <w:color w:val="000000"/>
+                <w:sz w:val="20"/>
+                <w:szCs w:val="20"/>
+                <w:lang w:val="id-ID"/>
+              </w:rPr>
+            </w:pPr>
+            <w:r>
+              <w:rPr>
+                <w:rFonts w:ascii="Cambria" w:eastAsia="Cambria" w:hAnsi="Cambria" w:cs="Cambria"/>
+                <w:color w:val="000000"/>
                 <w:sz w:val="20"/>
                 <w:szCs w:val="20"/>
                 <w:lang w:val="id-ID"/>
@@ -2546,16 +2573,16 @@
               <w:jc w:val="center"/>
               <w:rPr>
                 <w:rFonts w:ascii="Cambria" w:eastAsia="Cambria" w:hAnsi="Cambria" w:cs="Cambria"/>
-                <w:color w:val="EE0000"/>
-                <w:sz w:val="20"/>
-                <w:szCs w:val="20"/>
-                <w:lang w:val="id-ID"/>
-              </w:rPr>
-            </w:pPr>
-            <w:r>
-              <w:rPr>
-                <w:rFonts w:ascii="Cambria" w:eastAsia="Cambria" w:hAnsi="Cambria" w:cs="Cambria"/>
-                <w:color w:val="EE0000"/>
+                <w:color w:val="000000"/>
+                <w:sz w:val="20"/>
+                <w:szCs w:val="20"/>
+                <w:lang w:val="id-ID"/>
+              </w:rPr>
+            </w:pPr>
+            <w:r>
+              <w:rPr>
+                <w:rFonts w:ascii="Cambria" w:eastAsia="Cambria" w:hAnsi="Cambria" w:cs="Cambria"/>
+                <w:color w:val="000000"/>
                 <w:sz w:val="20"/>
                 <w:szCs w:val="20"/>
                 <w:lang w:val="id-ID"/>
@@ -2566,26 +2593,6 @@
         </w:tc>
       </w:tr>
     </w:tbl>
-    <w:p>
-      <w:pPr>
-        <w:pBdr>
-          <w:top w:val="nil"/>
-          <w:left w:val="nil"/>
-          <w:bottom w:val="nil"/>
-          <w:right w:val="nil"/>
-          <w:between w:val="nil"/>
-        </w:pBdr>
-        <w:spacing w:after="0" w:line="360" w:lineRule="auto"/>
-        <w:ind w:left="426"/>
-        <w:rPr>
-          <w:rFonts w:ascii="Cambria" w:eastAsia="Cambria" w:hAnsi="Cambria" w:cs="Cambria"/>
-          <w:color w:val="000000"/>
-          <w:sz w:val="24"/>
-          <w:szCs w:val="24"/>
-          <w:lang w:val="id-ID"/>
-        </w:rPr>
-      </w:pPr>
-    </w:p>
     <w:p>
       <w:pPr>
         <w:pBdr>
@@ -2609,6 +2616,7 @@
     </w:p>
     <w:p>
       <w:pPr>
+        <w:keepNext/>
         <w:pBdr>
           <w:top w:val="nil"/>
           <w:left w:val="nil"/>
@@ -2620,91 +2628,7 @@
         <w:ind w:left="426"/>
         <w:rPr>
           <w:rFonts w:ascii="Cambria" w:eastAsia="Cambria" w:hAnsi="Cambria" w:cs="Cambria"/>
-          <w:b/>
-          <w:bCs/>
-          <w:sz w:val="24"/>
-          <w:szCs w:val="24"/>
-          <w:lang w:val="id-ID"/>
-        </w:rPr>
-      </w:pPr>
-    </w:p>
-    <w:p>
-      <w:pPr>
-        <w:pBdr>
-          <w:top w:val="nil"/>
-          <w:left w:val="nil"/>
-          <w:bottom w:val="nil"/>
-          <w:right w:val="nil"/>
-          <w:between w:val="nil"/>
-        </w:pBdr>
-        <w:spacing w:after="0" w:line="360" w:lineRule="auto"/>
-        <w:ind w:left="426"/>
-        <w:rPr>
-          <w:rFonts w:ascii="Cambria" w:eastAsia="Cambria" w:hAnsi="Cambria" w:cs="Cambria"/>
-          <w:b/>
-          <w:bCs/>
-          <w:sz w:val="24"/>
-          <w:szCs w:val="24"/>
-          <w:lang w:val="id-ID"/>
-        </w:rPr>
-      </w:pPr>
-    </w:p>
-    <w:p>
-      <w:pPr>
-        <w:pBdr>
-          <w:top w:val="nil"/>
-          <w:left w:val="nil"/>
-          <w:bottom w:val="nil"/>
-          <w:right w:val="nil"/>
-          <w:between w:val="nil"/>
-        </w:pBdr>
-        <w:spacing w:after="0" w:line="360" w:lineRule="auto"/>
-        <w:ind w:left="426"/>
-        <w:rPr>
-          <w:rFonts w:ascii="Cambria" w:eastAsia="Cambria" w:hAnsi="Cambria" w:cs="Cambria"/>
-          <w:b/>
-          <w:bCs/>
-          <w:sz w:val="24"/>
-          <w:szCs w:val="24"/>
-          <w:lang w:val="id-ID"/>
-        </w:rPr>
-      </w:pPr>
-    </w:p>
-    <w:p>
-      <w:pPr>
-        <w:pBdr>
-          <w:top w:val="nil"/>
-          <w:left w:val="nil"/>
-          <w:bottom w:val="nil"/>
-          <w:right w:val="nil"/>
-          <w:between w:val="nil"/>
-        </w:pBdr>
-        <w:spacing w:after="0" w:line="360" w:lineRule="auto"/>
-        <w:ind w:left="426"/>
-        <w:rPr>
-          <w:rFonts w:ascii="Cambria" w:eastAsia="Cambria" w:hAnsi="Cambria" w:cs="Cambria"/>
-          <w:b/>
-          <w:bCs/>
-          <w:sz w:val="24"/>
-          <w:szCs w:val="24"/>
-          <w:lang w:val="id-ID"/>
-        </w:rPr>
-      </w:pPr>
-    </w:p>
-    <w:p>
-      <w:pPr>
-        <w:pBdr>
-          <w:top w:val="nil"/>
-          <w:left w:val="nil"/>
-          <w:bottom w:val="nil"/>
-          <w:right w:val="nil"/>
-          <w:between w:val="nil"/>
-        </w:pBdr>
-        <w:spacing w:after="0" w:line="360" w:lineRule="auto"/>
-        <w:ind w:left="426"/>
-        <w:rPr>
-          <w:rFonts w:ascii="Cambria" w:eastAsia="Cambria" w:hAnsi="Cambria" w:cs="Cambria"/>
-          <w:color w:val="00B050"/>
+          <w:color w:val="000000"/>
           <w:sz w:val="24"/>
           <w:szCs w:val="24"/>
           <w:lang w:val="id-ID"/>
@@ -2715,7 +2639,7 @@
           <w:rFonts w:ascii="Cambria" w:eastAsia="Cambria" w:hAnsi="Cambria" w:cs="Cambria"/>
           <w:b/>
           <w:bCs/>
-          <w:color w:val="00B050"/>
+          <w:color w:val="000000"/>
           <w:sz w:val="24"/>
           <w:szCs w:val="24"/>
           <w:lang w:val="id-ID"/>
@@ -2724,27 +2648,11 @@
         <w:t>Informasi Umum Kegiatan DAK TA 2026</w:t>
       </w:r>
     </w:p>
-    <w:p>
-      <w:pPr>
-        <w:spacing w:after="0" w:line="360" w:lineRule="auto"/>
-        <w:ind w:left="426"/>
-        <w:rPr>
-          <w:rFonts w:ascii="Cambria" w:eastAsia="Cambria" w:hAnsi="Cambria" w:cs="Cambria"/>
-          <w:b/>
-          <w:bCs/>
-          <w:color w:val="00B050"/>
-          <w:sz w:val="24"/>
-          <w:szCs w:val="24"/>
-          <w:lang w:val="id-ID"/>
-        </w:rPr>
-      </w:pPr>
-    </w:p>
     <w:tbl>
       <w:tblPr>
         <w:tblStyle w:val="a2"/>
-        <w:tblpPr w:leftFromText="180" w:rightFromText="180" w:topFromText="180" w:bottomFromText="180" w:vertAnchor="text" w:tblpX="335"/>
         <w:tblW w:w="9345" w:type="dxa"/>
-        <w:tblInd w:w="0" w:type="dxa"/>
+        <w:tblInd w:w="426" w:type="dxa"/>
         <w:tblBorders>
           <w:top w:val="single" w:sz="4" w:space="0" w:color="000000"/>
           <w:left w:val="single" w:sz="4" w:space="0" w:color="000000"/>
@@ -2766,6 +2674,7 @@
       </w:tblGrid>
       <w:tr>
         <w:trPr>
+          <w:cantSplit/>
           <w:trHeight w:val="421"/>
           <w:tblHeader/>
         </w:trPr>
@@ -2964,6 +2873,7 @@
       </w:tr>
       <w:tr>
         <w:trPr>
+          <w:cantSplit/>
           <w:trHeight w:val="903"/>
         </w:trPr>
         <w:tc>
@@ -2977,16 +2887,16 @@
               <w:spacing w:after="200" w:line="360" w:lineRule="auto"/>
               <w:rPr>
                 <w:rFonts w:ascii="Cambria" w:eastAsia="Cambria" w:hAnsi="Cambria" w:cs="Cambria"/>
-                <w:color w:val="00B050"/>
-                <w:sz w:val="20"/>
-                <w:szCs w:val="20"/>
-                <w:lang w:val="id-ID"/>
-              </w:rPr>
-            </w:pPr>
-            <w:r>
-              <w:rPr>
-                <w:rFonts w:ascii="Cambria" w:eastAsia="Cambria" w:hAnsi="Cambria" w:cs="Cambria"/>
-                <w:color w:val="00B050"/>
+                <w:color w:val="000000"/>
+                <w:sz w:val="20"/>
+                <w:szCs w:val="20"/>
+                <w:lang w:val="id-ID"/>
+              </w:rPr>
+            </w:pPr>
+            <w:r>
+              <w:rPr>
+                <w:rFonts w:ascii="Cambria" w:eastAsia="Cambria" w:hAnsi="Cambria" w:cs="Cambria"/>
+                <w:color w:val="000000"/>
                 <w:sz w:val="20"/>
                 <w:szCs w:val="20"/>
                 <w:lang w:val="id-ID"/>
@@ -3030,16 +2940,16 @@
               <w:spacing w:after="200" w:line="360" w:lineRule="auto"/>
               <w:rPr>
                 <w:rFonts w:ascii="Cambria" w:eastAsia="Cambria" w:hAnsi="Cambria" w:cs="Cambria"/>
-                <w:color w:val="00B050"/>
-                <w:sz w:val="20"/>
-                <w:szCs w:val="20"/>
-                <w:lang w:val="id-ID"/>
-              </w:rPr>
-            </w:pPr>
-            <w:r>
-              <w:rPr>
-                <w:rFonts w:ascii="Cambria" w:eastAsia="Cambria" w:hAnsi="Cambria" w:cs="Cambria"/>
-                <w:color w:val="00B050"/>
+                <w:color w:val="000000"/>
+                <w:sz w:val="20"/>
+                <w:szCs w:val="20"/>
+                <w:lang w:val="id-ID"/>
+              </w:rPr>
+            </w:pPr>
+            <w:r>
+              <w:rPr>
+                <w:rFonts w:ascii="Cambria" w:eastAsia="Cambria" w:hAnsi="Cambria" w:cs="Cambria"/>
+                <w:color w:val="000000"/>
                 <w:sz w:val="20"/>
                 <w:szCs w:val="20"/>
                 <w:lang w:val="id-ID"/>
@@ -3058,16 +2968,16 @@
               <w:spacing w:after="200" w:line="360" w:lineRule="auto"/>
               <w:rPr>
                 <w:rFonts w:ascii="Cambria" w:eastAsia="Cambria" w:hAnsi="Cambria" w:cs="Cambria"/>
-                <w:color w:val="00B050"/>
-                <w:sz w:val="20"/>
-                <w:szCs w:val="20"/>
-                <w:lang w:val="id-ID"/>
-              </w:rPr>
-            </w:pPr>
-            <w:r>
-              <w:rPr>
-                <w:rFonts w:ascii="Cambria" w:eastAsia="Cambria" w:hAnsi="Cambria" w:cs="Cambria"/>
-                <w:color w:val="00B050"/>
+                <w:color w:val="000000"/>
+                <w:sz w:val="20"/>
+                <w:szCs w:val="20"/>
+                <w:lang w:val="id-ID"/>
+              </w:rPr>
+            </w:pPr>
+            <w:r>
+              <w:rPr>
+                <w:rFonts w:ascii="Cambria" w:eastAsia="Cambria" w:hAnsi="Cambria" w:cs="Cambria"/>
+                <w:color w:val="000000"/>
                 <w:sz w:val="20"/>
                 <w:szCs w:val="20"/>
                 <w:lang w:val="id-ID"/>
@@ -3085,16 +2995,16 @@
               <w:spacing w:after="200" w:line="360" w:lineRule="auto"/>
               <w:rPr>
                 <w:rFonts w:ascii="Cambria" w:eastAsia="Cambria" w:hAnsi="Cambria" w:cs="Cambria"/>
-                <w:color w:val="00B050"/>
-                <w:sz w:val="20"/>
-                <w:szCs w:val="20"/>
-                <w:lang w:val="id-ID"/>
-              </w:rPr>
-            </w:pPr>
-            <w:r>
-              <w:rPr>
-                <w:rFonts w:ascii="Cambria" w:eastAsia="Cambria" w:hAnsi="Cambria" w:cs="Cambria"/>
-                <w:color w:val="00B050"/>
+                <w:color w:val="000000"/>
+                <w:sz w:val="20"/>
+                <w:szCs w:val="20"/>
+                <w:lang w:val="id-ID"/>
+              </w:rPr>
+            </w:pPr>
+            <w:r>
+              <w:rPr>
+                <w:rFonts w:ascii="Cambria" w:eastAsia="Cambria" w:hAnsi="Cambria" w:cs="Cambria"/>
+                <w:color w:val="000000"/>
                 <w:sz w:val="20"/>
                 <w:szCs w:val="20"/>
                 <w:lang w:val="id-ID"/>
@@ -3112,16 +3022,16 @@
               <w:spacing w:after="200" w:line="360" w:lineRule="auto"/>
               <w:rPr>
                 <w:rFonts w:ascii="Cambria" w:eastAsia="Cambria" w:hAnsi="Cambria" w:cs="Cambria"/>
-                <w:color w:val="00B050"/>
-                <w:sz w:val="20"/>
-                <w:szCs w:val="20"/>
-                <w:lang w:val="id-ID"/>
-              </w:rPr>
-            </w:pPr>
-            <w:r>
-              <w:rPr>
-                <w:rFonts w:ascii="Cambria" w:eastAsia="Cambria" w:hAnsi="Cambria" w:cs="Cambria"/>
-                <w:color w:val="00B050"/>
+                <w:color w:val="000000"/>
+                <w:sz w:val="20"/>
+                <w:szCs w:val="20"/>
+                <w:lang w:val="id-ID"/>
+              </w:rPr>
+            </w:pPr>
+            <w:r>
+              <w:rPr>
+                <w:rFonts w:ascii="Cambria" w:eastAsia="Cambria" w:hAnsi="Cambria" w:cs="Cambria"/>
+                <w:color w:val="000000"/>
                 <w:sz w:val="20"/>
                 <w:szCs w:val="20"/>
                 <w:lang w:val="id-ID"/>
@@ -3133,6 +3043,7 @@
       </w:tr>
       <w:tr>
         <w:trPr>
+          <w:cantSplit/>
           <w:trHeight w:val="903"/>
         </w:trPr>
         <w:tc>
@@ -3147,7 +3058,7 @@
               <w:spacing w:line="276" w:lineRule="auto"/>
               <w:rPr>
                 <w:rFonts w:ascii="Cambria" w:eastAsia="Cambria" w:hAnsi="Cambria" w:cs="Cambria"/>
-                <w:color w:val="00B050"/>
+                <w:color w:val="000000"/>
                 <w:sz w:val="20"/>
                 <w:szCs w:val="20"/>
                 <w:lang w:val="id-ID"/>
@@ -3190,16 +3101,16 @@
               <w:spacing w:after="200" w:line="360" w:lineRule="auto"/>
               <w:rPr>
                 <w:rFonts w:ascii="Cambria" w:eastAsia="Cambria" w:hAnsi="Cambria" w:cs="Cambria"/>
-                <w:color w:val="00B050"/>
-                <w:sz w:val="20"/>
-                <w:szCs w:val="20"/>
-                <w:lang w:val="id-ID"/>
-              </w:rPr>
-            </w:pPr>
-            <w:r>
-              <w:rPr>
-                <w:rFonts w:ascii="Cambria" w:eastAsia="Cambria" w:hAnsi="Cambria" w:cs="Cambria"/>
-                <w:color w:val="00B050"/>
+                <w:color w:val="000000"/>
+                <w:sz w:val="20"/>
+                <w:szCs w:val="20"/>
+                <w:lang w:val="id-ID"/>
+              </w:rPr>
+            </w:pPr>
+            <w:r>
+              <w:rPr>
+                <w:rFonts w:ascii="Cambria" w:eastAsia="Cambria" w:hAnsi="Cambria" w:cs="Cambria"/>
+                <w:color w:val="000000"/>
                 <w:sz w:val="20"/>
                 <w:szCs w:val="20"/>
                 <w:lang w:val="id-ID"/>
@@ -3218,16 +3129,16 @@
               <w:spacing w:line="360" w:lineRule="auto"/>
               <w:rPr>
                 <w:rFonts w:ascii="Cambria" w:eastAsia="Cambria" w:hAnsi="Cambria" w:cs="Cambria"/>
-                <w:color w:val="00B050"/>
-                <w:sz w:val="20"/>
-                <w:szCs w:val="20"/>
-                <w:lang w:val="id-ID"/>
-              </w:rPr>
-            </w:pPr>
-            <w:r>
-              <w:rPr>
-                <w:rFonts w:ascii="Cambria" w:eastAsia="Cambria" w:hAnsi="Cambria" w:cs="Cambria"/>
-                <w:color w:val="00B050"/>
+                <w:color w:val="000000"/>
+                <w:sz w:val="20"/>
+                <w:szCs w:val="20"/>
+                <w:lang w:val="id-ID"/>
+              </w:rPr>
+            </w:pPr>
+            <w:r>
+              <w:rPr>
+                <w:rFonts w:ascii="Cambria" w:eastAsia="Cambria" w:hAnsi="Cambria" w:cs="Cambria"/>
+                <w:color w:val="000000"/>
                 <w:sz w:val="20"/>
                 <w:szCs w:val="20"/>
                 <w:lang w:val="id-ID"/>
@@ -3240,7 +3151,7 @@
               <w:spacing w:after="200" w:line="360" w:lineRule="auto"/>
               <w:rPr>
                 <w:rFonts w:ascii="Cambria" w:eastAsia="Cambria" w:hAnsi="Cambria" w:cs="Cambria"/>
-                <w:color w:val="00B050"/>
+                <w:color w:val="000000"/>
                 <w:sz w:val="20"/>
                 <w:szCs w:val="20"/>
                 <w:lang w:val="id-ID"/>
@@ -3257,16 +3168,16 @@
               <w:spacing w:line="360" w:lineRule="auto"/>
               <w:rPr>
                 <w:rFonts w:ascii="Cambria" w:eastAsia="Cambria" w:hAnsi="Cambria" w:cs="Cambria"/>
-                <w:color w:val="00B050"/>
-                <w:sz w:val="20"/>
-                <w:szCs w:val="20"/>
-                <w:lang w:val="id-ID"/>
-              </w:rPr>
-            </w:pPr>
-            <w:r>
-              <w:rPr>
-                <w:rFonts w:ascii="Cambria" w:eastAsia="Cambria" w:hAnsi="Cambria" w:cs="Cambria"/>
-                <w:color w:val="00B050"/>
+                <w:color w:val="000000"/>
+                <w:sz w:val="20"/>
+                <w:szCs w:val="20"/>
+                <w:lang w:val="id-ID"/>
+              </w:rPr>
+            </w:pPr>
+            <w:r>
+              <w:rPr>
+                <w:rFonts w:ascii="Cambria" w:eastAsia="Cambria" w:hAnsi="Cambria" w:cs="Cambria"/>
+                <w:color w:val="000000"/>
                 <w:sz w:val="20"/>
                 <w:szCs w:val="20"/>
                 <w:lang w:val="id-ID"/>
@@ -3284,16 +3195,16 @@
               <w:spacing w:after="200" w:line="360" w:lineRule="auto"/>
               <w:rPr>
                 <w:rFonts w:ascii="Cambria" w:eastAsia="Cambria" w:hAnsi="Cambria" w:cs="Cambria"/>
-                <w:color w:val="00B050"/>
-                <w:sz w:val="20"/>
-                <w:szCs w:val="20"/>
-                <w:lang w:val="id-ID"/>
-              </w:rPr>
-            </w:pPr>
-            <w:r>
-              <w:rPr>
-                <w:rFonts w:ascii="Cambria" w:eastAsia="Cambria" w:hAnsi="Cambria" w:cs="Cambria"/>
-                <w:color w:val="00B050"/>
+                <w:color w:val="000000"/>
+                <w:sz w:val="20"/>
+                <w:szCs w:val="20"/>
+                <w:lang w:val="id-ID"/>
+              </w:rPr>
+            </w:pPr>
+            <w:r>
+              <w:rPr>
+                <w:rFonts w:ascii="Cambria" w:eastAsia="Cambria" w:hAnsi="Cambria" w:cs="Cambria"/>
+                <w:color w:val="000000"/>
                 <w:sz w:val="20"/>
                 <w:szCs w:val="20"/>
                 <w:lang w:val="id-ID"/>
@@ -3305,6 +3216,7 @@
       </w:tr>
       <w:tr>
         <w:trPr>
+          <w:cantSplit/>
           <w:trHeight w:val="903"/>
         </w:trPr>
         <w:tc>
@@ -3319,7 +3231,7 @@
               <w:spacing w:line="276" w:lineRule="auto"/>
               <w:rPr>
                 <w:rFonts w:ascii="Cambria" w:eastAsia="Cambria" w:hAnsi="Cambria" w:cs="Cambria"/>
-                <w:color w:val="00B050"/>
+                <w:color w:val="000000"/>
                 <w:sz w:val="20"/>
                 <w:szCs w:val="20"/>
                 <w:lang w:val="id-ID"/>
@@ -3362,16 +3274,16 @@
               <w:spacing w:after="200" w:line="360" w:lineRule="auto"/>
               <w:rPr>
                 <w:rFonts w:ascii="Cambria" w:eastAsia="Cambria" w:hAnsi="Cambria" w:cs="Cambria"/>
-                <w:color w:val="00B050"/>
-                <w:sz w:val="20"/>
-                <w:szCs w:val="20"/>
-                <w:lang w:val="id-ID"/>
-              </w:rPr>
-            </w:pPr>
-            <w:r>
-              <w:rPr>
-                <w:rFonts w:ascii="Cambria" w:eastAsia="Cambria" w:hAnsi="Cambria" w:cs="Cambria"/>
-                <w:color w:val="00B050"/>
+                <w:color w:val="000000"/>
+                <w:sz w:val="20"/>
+                <w:szCs w:val="20"/>
+                <w:lang w:val="id-ID"/>
+              </w:rPr>
+            </w:pPr>
+            <w:r>
+              <w:rPr>
+                <w:rFonts w:ascii="Cambria" w:eastAsia="Cambria" w:hAnsi="Cambria" w:cs="Cambria"/>
+                <w:color w:val="000000"/>
                 <w:sz w:val="20"/>
                 <w:szCs w:val="20"/>
                 <w:lang w:val="id-ID"/>
@@ -3390,16 +3302,16 @@
               <w:spacing w:after="200" w:line="360" w:lineRule="auto"/>
               <w:rPr>
                 <w:rFonts w:ascii="Cambria" w:eastAsia="Cambria" w:hAnsi="Cambria" w:cs="Cambria"/>
-                <w:color w:val="00B050"/>
-                <w:sz w:val="20"/>
-                <w:szCs w:val="20"/>
-                <w:lang w:val="id-ID"/>
-              </w:rPr>
-            </w:pPr>
-            <w:r>
-              <w:rPr>
-                <w:rFonts w:ascii="Cambria" w:eastAsia="Cambria" w:hAnsi="Cambria" w:cs="Cambria"/>
-                <w:color w:val="00B050"/>
+                <w:color w:val="000000"/>
+                <w:sz w:val="20"/>
+                <w:szCs w:val="20"/>
+                <w:lang w:val="id-ID"/>
+              </w:rPr>
+            </w:pPr>
+            <w:r>
+              <w:rPr>
+                <w:rFonts w:ascii="Cambria" w:eastAsia="Cambria" w:hAnsi="Cambria" w:cs="Cambria"/>
+                <w:color w:val="000000"/>
                 <w:sz w:val="20"/>
                 <w:szCs w:val="20"/>
                 <w:lang w:val="id-ID"/>
@@ -3417,16 +3329,16 @@
               <w:spacing w:after="200" w:line="360" w:lineRule="auto"/>
               <w:rPr>
                 <w:rFonts w:ascii="Cambria" w:eastAsia="Cambria" w:hAnsi="Cambria" w:cs="Cambria"/>
-                <w:color w:val="00B050"/>
-                <w:sz w:val="20"/>
-                <w:szCs w:val="20"/>
-                <w:lang w:val="id-ID"/>
-              </w:rPr>
-            </w:pPr>
-            <w:r>
-              <w:rPr>
-                <w:rFonts w:ascii="Cambria" w:eastAsia="Cambria" w:hAnsi="Cambria" w:cs="Cambria"/>
-                <w:color w:val="00B050"/>
+                <w:color w:val="000000"/>
+                <w:sz w:val="20"/>
+                <w:szCs w:val="20"/>
+                <w:lang w:val="id-ID"/>
+              </w:rPr>
+            </w:pPr>
+            <w:r>
+              <w:rPr>
+                <w:rFonts w:ascii="Cambria" w:eastAsia="Cambria" w:hAnsi="Cambria" w:cs="Cambria"/>
+                <w:color w:val="000000"/>
                 <w:sz w:val="20"/>
                 <w:szCs w:val="20"/>
                 <w:lang w:val="id-ID"/>
@@ -3444,16 +3356,16 @@
               <w:spacing w:after="200" w:line="360" w:lineRule="auto"/>
               <w:rPr>
                 <w:rFonts w:ascii="Cambria" w:eastAsia="Cambria" w:hAnsi="Cambria" w:cs="Cambria"/>
-                <w:color w:val="00B050"/>
-                <w:sz w:val="20"/>
-                <w:szCs w:val="20"/>
-                <w:lang w:val="id-ID"/>
-              </w:rPr>
-            </w:pPr>
-            <w:r>
-              <w:rPr>
-                <w:rFonts w:ascii="Cambria" w:eastAsia="Cambria" w:hAnsi="Cambria" w:cs="Cambria"/>
-                <w:color w:val="00B050"/>
+                <w:color w:val="000000"/>
+                <w:sz w:val="20"/>
+                <w:szCs w:val="20"/>
+                <w:lang w:val="id-ID"/>
+              </w:rPr>
+            </w:pPr>
+            <w:r>
+              <w:rPr>
+                <w:rFonts w:ascii="Cambria" w:eastAsia="Cambria" w:hAnsi="Cambria" w:cs="Cambria"/>
+                <w:color w:val="000000"/>
                 <w:sz w:val="20"/>
                 <w:szCs w:val="20"/>
                 <w:lang w:val="id-ID"/>
@@ -3465,6 +3377,7 @@
       </w:tr>
       <w:tr>
         <w:trPr>
+          <w:cantSplit/>
           <w:trHeight w:val="903"/>
         </w:trPr>
         <w:tc>
@@ -3479,7 +3392,7 @@
               <w:spacing w:line="276" w:lineRule="auto"/>
               <w:rPr>
                 <w:rFonts w:ascii="Cambria" w:eastAsia="Cambria" w:hAnsi="Cambria" w:cs="Cambria"/>
-                <w:color w:val="00B050"/>
+                <w:color w:val="000000"/>
                 <w:sz w:val="20"/>
                 <w:szCs w:val="20"/>
                 <w:lang w:val="id-ID"/>
@@ -3523,16 +3436,16 @@
               <w:spacing w:after="200" w:line="360" w:lineRule="auto"/>
               <w:rPr>
                 <w:rFonts w:ascii="Cambria" w:eastAsia="Cambria" w:hAnsi="Cambria" w:cs="Cambria"/>
-                <w:color w:val="00B050"/>
-                <w:sz w:val="20"/>
-                <w:szCs w:val="20"/>
-                <w:lang w:val="id-ID"/>
-              </w:rPr>
-            </w:pPr>
-            <w:r>
-              <w:rPr>
-                <w:rFonts w:ascii="Cambria" w:eastAsia="Cambria" w:hAnsi="Cambria" w:cs="Cambria"/>
-                <w:color w:val="00B050"/>
+                <w:color w:val="000000"/>
+                <w:sz w:val="20"/>
+                <w:szCs w:val="20"/>
+                <w:lang w:val="id-ID"/>
+              </w:rPr>
+            </w:pPr>
+            <w:r>
+              <w:rPr>
+                <w:rFonts w:ascii="Cambria" w:eastAsia="Cambria" w:hAnsi="Cambria" w:cs="Cambria"/>
+                <w:color w:val="000000"/>
                 <w:sz w:val="20"/>
                 <w:szCs w:val="20"/>
                 <w:lang w:val="id-ID"/>
@@ -3551,16 +3464,16 @@
               <w:spacing w:line="360" w:lineRule="auto"/>
               <w:rPr>
                 <w:rFonts w:ascii="Cambria" w:eastAsia="Cambria" w:hAnsi="Cambria" w:cs="Cambria"/>
-                <w:color w:val="00B050"/>
-                <w:sz w:val="20"/>
-                <w:szCs w:val="20"/>
-                <w:lang w:val="id-ID"/>
-              </w:rPr>
-            </w:pPr>
-            <w:r>
-              <w:rPr>
-                <w:rFonts w:ascii="Cambria" w:eastAsia="Cambria" w:hAnsi="Cambria" w:cs="Cambria"/>
-                <w:color w:val="00B050"/>
+                <w:color w:val="000000"/>
+                <w:sz w:val="20"/>
+                <w:szCs w:val="20"/>
+                <w:lang w:val="id-ID"/>
+              </w:rPr>
+            </w:pPr>
+            <w:r>
+              <w:rPr>
+                <w:rFonts w:ascii="Cambria" w:eastAsia="Cambria" w:hAnsi="Cambria" w:cs="Cambria"/>
+                <w:color w:val="000000"/>
                 <w:sz w:val="20"/>
                 <w:szCs w:val="20"/>
                 <w:lang w:val="id-ID"/>
@@ -3578,16 +3491,16 @@
               <w:spacing w:after="200" w:line="360" w:lineRule="auto"/>
               <w:rPr>
                 <w:rFonts w:ascii="Cambria" w:eastAsia="Cambria" w:hAnsi="Cambria" w:cs="Cambria"/>
-                <w:color w:val="00B050"/>
-                <w:sz w:val="20"/>
-                <w:szCs w:val="20"/>
-                <w:lang w:val="id-ID"/>
-              </w:rPr>
-            </w:pPr>
-            <w:r>
-              <w:rPr>
-                <w:rFonts w:ascii="Cambria" w:eastAsia="Cambria" w:hAnsi="Cambria" w:cs="Cambria"/>
-                <w:color w:val="00B050"/>
+                <w:color w:val="000000"/>
+                <w:sz w:val="20"/>
+                <w:szCs w:val="20"/>
+                <w:lang w:val="id-ID"/>
+              </w:rPr>
+            </w:pPr>
+            <w:r>
+              <w:rPr>
+                <w:rFonts w:ascii="Cambria" w:eastAsia="Cambria" w:hAnsi="Cambria" w:cs="Cambria"/>
+                <w:color w:val="000000"/>
                 <w:sz w:val="20"/>
                 <w:szCs w:val="20"/>
                 <w:lang w:val="id-ID"/>
@@ -3605,16 +3518,16 @@
               <w:spacing w:after="200" w:line="360" w:lineRule="auto"/>
               <w:rPr>
                 <w:rFonts w:ascii="Cambria" w:eastAsia="Cambria" w:hAnsi="Cambria" w:cs="Cambria"/>
-                <w:color w:val="00B050"/>
-                <w:sz w:val="20"/>
-                <w:szCs w:val="20"/>
-                <w:lang w:val="id-ID"/>
-              </w:rPr>
-            </w:pPr>
-            <w:r>
-              <w:rPr>
-                <w:rFonts w:ascii="Cambria" w:eastAsia="Cambria" w:hAnsi="Cambria" w:cs="Cambria"/>
-                <w:color w:val="00B050"/>
+                <w:color w:val="000000"/>
+                <w:sz w:val="20"/>
+                <w:szCs w:val="20"/>
+                <w:lang w:val="id-ID"/>
+              </w:rPr>
+            </w:pPr>
+            <w:r>
+              <w:rPr>
+                <w:rFonts w:ascii="Cambria" w:eastAsia="Cambria" w:hAnsi="Cambria" w:cs="Cambria"/>
+                <w:color w:val="000000"/>
                 <w:sz w:val="20"/>
                 <w:szCs w:val="20"/>
                 <w:lang w:val="id-ID"/>
@@ -3626,7 +3539,13 @@
       </w:tr>
     </w:tbl>
     <w:p>
+      <w:r>
+        <w:t xml:space="preserve">{#adaCatatan}</w:t>
+      </w:r>
+    </w:p>
+    <w:p>
       <w:pPr>
+        <w:keepNext/>
         <w:pBdr>
           <w:top w:val="nil"/>
           <w:left w:val="nil"/>
@@ -3635,7 +3554,7 @@
           <w:between w:val="nil"/>
         </w:pBdr>
         <w:spacing w:after="0" w:line="360" w:lineRule="auto"/>
-        <w:ind w:left="1146" w:hanging="720"/>
+        <w:ind w:left="426"/>
         <w:rPr>
           <w:rFonts w:ascii="Cambria" w:eastAsia="Cambria" w:hAnsi="Cambria" w:cs="Cambria"/>
           <w:sz w:val="24"/>
@@ -3697,7 +3616,13 @@
       </w:r>
     </w:p>
     <w:p>
+      <w:r>
+        <w:t xml:space="preserve">{/adaCatatan}</w:t>
+      </w:r>
+    </w:p>
+    <w:p>
       <w:pPr>
+        <w:keepNext/>
         <w:numPr>
           <w:ilvl w:val="0"/>
           <w:numId w:val="1"/>
@@ -3736,6 +3661,7 @@
     </w:p>
     <w:p>
       <w:pPr>
+        <w:keepNext/>
         <w:spacing w:after="0" w:line="360" w:lineRule="auto"/>
         <w:ind w:left="426"/>
         <w:jc w:val="both"/>
@@ -3781,7 +3707,7 @@
       <w:r>
         <w:rPr>
           <w:rFonts w:ascii="Cambria" w:eastAsia="Cambria" w:hAnsi="Cambria" w:cs="Cambria"/>
-          <w:color w:val="EE0000"/>
+          <w:color w:val="000000"/>
           <w:sz w:val="24"/>
           <w:szCs w:val="24"/>
           <w:lang w:val="id-ID"/>
@@ -3823,7 +3749,7 @@
       <w:r>
         <w:rPr>
           <w:rFonts w:ascii="Cambria" w:eastAsia="Cambria" w:hAnsi="Cambria" w:cs="Cambria"/>
-          <w:color w:val="EE0000"/>
+          <w:color w:val="000000"/>
           <w:sz w:val="24"/>
           <w:szCs w:val="24"/>
           <w:lang w:val="id-ID"/>
@@ -3920,7 +3846,13 @@
       </w:r>
     </w:p>
     <w:p>
+      <w:r>
+        <w:t xml:space="preserve">{#adaTindakLanjut}</w:t>
+      </w:r>
+    </w:p>
+    <w:p>
       <w:pPr>
+        <w:keepNext/>
         <w:numPr>
           <w:ilvl w:val="0"/>
           <w:numId w:val="1"/>
@@ -3982,6 +3914,7 @@
       </w:tblGrid>
       <w:tr>
         <w:trPr>
+          <w:cantSplit/>
           <w:trHeight w:val="409"/>
           <w:tblHeader/>
         </w:trPr>
@@ -4192,6 +4125,9 @@
         </w:tc>
       </w:tr>
       <w:tr>
+        <w:trPr>
+          <w:cantSplit/>
+        </w:trPr>
         <w:tc>
           <w:tcPr>
             <w:tcW w:w="703" w:type="dxa"/>
@@ -4391,34 +4327,8 @@
       </w:tr>
     </w:tbl>
     <w:p>
-      <w:pPr>
-        <w:pBdr>
-          <w:top w:val="nil"/>
-          <w:left w:val="nil"/>
-          <w:bottom w:val="nil"/>
-          <w:right w:val="nil"/>
-          <w:between w:val="nil"/>
-        </w:pBdr>
-        <w:spacing w:before="120" w:after="0" w:line="360" w:lineRule="auto"/>
-        <w:ind w:left="426"/>
-        <w:jc w:val="right"/>
-        <w:rPr>
-          <w:rFonts w:ascii="Cambria" w:eastAsia="Cambria" w:hAnsi="Cambria" w:cs="Cambria"/>
-          <w:color w:val="FF0000"/>
-          <w:sz w:val="18"/>
-          <w:szCs w:val="18"/>
-          <w:lang w:val="id-ID"/>
-        </w:rPr>
-      </w:pPr>
       <w:r>
-        <w:rPr>
-          <w:rFonts w:ascii="Cambria" w:eastAsia="Cambria" w:hAnsi="Cambria" w:cs="Cambria"/>
-          <w:color w:val="FF0000"/>
-          <w:sz w:val="18"/>
-          <w:szCs w:val="18"/>
-          <w:lang w:val="id-ID"/>
-        </w:rPr>
-        <w:t>Data diatas bersifat opsional, mohon dihapus apabila tidak ada dan dapat ditambahkan item lain.</w:t>
+        <w:t xml:space="preserve">{/adaTindakLanjut}</w:t>
       </w:r>
     </w:p>
     <w:p>
@@ -4435,7 +4345,7 @@
         <w:jc w:val="right"/>
         <w:rPr>
           <w:rFonts w:ascii="Cambria" w:eastAsia="Cambria" w:hAnsi="Cambria" w:cs="Cambria"/>
-          <w:color w:val="FF0000"/>
+          <w:color w:val="000000"/>
           <w:sz w:val="18"/>
           <w:szCs w:val="18"/>
           <w:lang w:val="id-ID"/>
@@ -4444,48 +4354,7 @@
     </w:p>
     <w:p>
       <w:pPr>
-        <w:pBdr>
-          <w:top w:val="nil"/>
-          <w:left w:val="nil"/>
-          <w:bottom w:val="nil"/>
-          <w:right w:val="nil"/>
-          <w:between w:val="nil"/>
-        </w:pBdr>
-        <w:spacing w:after="0" w:line="360" w:lineRule="auto"/>
-        <w:ind w:left="426"/>
-        <w:jc w:val="right"/>
-        <w:rPr>
-          <w:rFonts w:ascii="Cambria" w:eastAsia="Cambria" w:hAnsi="Cambria" w:cs="Cambria"/>
-          <w:color w:val="FF0000"/>
-          <w:sz w:val="18"/>
-          <w:szCs w:val="18"/>
-          <w:lang w:val="id-ID"/>
-        </w:rPr>
-      </w:pPr>
-    </w:p>
-    <w:p>
-      <w:pPr>
-        <w:pBdr>
-          <w:top w:val="nil"/>
-          <w:left w:val="nil"/>
-          <w:bottom w:val="nil"/>
-          <w:right w:val="nil"/>
-          <w:between w:val="nil"/>
-        </w:pBdr>
-        <w:spacing w:after="0" w:line="360" w:lineRule="auto"/>
-        <w:ind w:left="426"/>
-        <w:jc w:val="right"/>
-        <w:rPr>
-          <w:rFonts w:ascii="Cambria" w:eastAsia="Cambria" w:hAnsi="Cambria" w:cs="Cambria"/>
-          <w:color w:val="FF0000"/>
-          <w:sz w:val="18"/>
-          <w:szCs w:val="18"/>
-          <w:lang w:val="id-ID"/>
-        </w:rPr>
-      </w:pPr>
-    </w:p>
-    <w:p>
-      <w:pPr>
+        <w:keepNext/>
         <w:numPr>
           <w:ilvl w:val="0"/>
           <w:numId w:val="1"/>
@@ -4549,7 +4418,9 @@
       </w:tblGrid>
       <w:tr>
         <w:trPr>
+          <w:cantSplit/>
           <w:trHeight w:val="392"/>
+          <w:tblHeader/>
         </w:trPr>
         <w:tc>
           <w:tcPr>
@@ -4636,7 +4507,9 @@
       </w:tr>
       <w:tr>
         <w:trPr>
+          <w:cantSplit/>
           <w:trHeight w:val="871"/>
+          <w:tblHeader/>
         </w:trPr>
         <w:tc>
           <w:tcPr>
@@ -4910,6 +4783,7 @@
       </w:tr>
       <w:tr>
         <w:trPr>
+          <w:cantSplit/>
           <w:trHeight w:val="586"/>
         </w:trPr>
         <w:tc>
@@ -5280,46 +5154,7 @@
     </w:p>
     <w:p>
       <w:pPr>
-        <w:pBdr>
-          <w:top w:val="nil"/>
-          <w:left w:val="nil"/>
-          <w:bottom w:val="nil"/>
-          <w:right w:val="nil"/>
-          <w:between w:val="nil"/>
-        </w:pBdr>
-        <w:spacing w:after="0"/>
-        <w:ind w:left="1146"/>
-        <w:jc w:val="center"/>
-        <w:rPr>
-          <w:rFonts w:ascii="Cambria" w:eastAsia="Cambria" w:hAnsi="Cambria" w:cs="Cambria"/>
-          <w:b/>
-          <w:bCs/>
-          <w:lang w:val="id-ID"/>
-        </w:rPr>
-      </w:pPr>
-    </w:p>
-    <w:p>
-      <w:pPr>
-        <w:pBdr>
-          <w:top w:val="nil"/>
-          <w:left w:val="nil"/>
-          <w:bottom w:val="nil"/>
-          <w:right w:val="nil"/>
-          <w:between w:val="nil"/>
-        </w:pBdr>
-        <w:spacing w:after="0"/>
-        <w:ind w:left="1146"/>
-        <w:jc w:val="center"/>
-        <w:rPr>
-          <w:rFonts w:ascii="Cambria" w:eastAsia="Cambria" w:hAnsi="Cambria" w:cs="Cambria"/>
-          <w:b/>
-          <w:bCs/>
-          <w:lang w:val="id-ID"/>
-        </w:rPr>
-      </w:pPr>
-    </w:p>
-    <w:p>
-      <w:pPr>
+        <w:keepNext/>
         <w:numPr>
           <w:ilvl w:val="0"/>
           <w:numId w:val="1"/>
@@ -5375,6 +5210,9 @@
         <w:gridCol w:w="3827"/>
       </w:tblGrid>
       <w:tr>
+        <w:trPr>
+          <w:cantSplit/>
+        </w:trPr>
         <w:tc>
           <w:tcPr>
             <w:tcW w:w="2410" w:type="dxa"/>
@@ -5524,6 +5362,7 @@
       </w:tr>
       <w:tr>
         <w:trPr>
+          <w:cantSplit/>
           <w:trHeight w:val="671"/>
         </w:trPr>
         <w:tc>
@@ -5616,6 +5455,7 @@
       </w:tr>
       <w:tr>
         <w:trPr>
+          <w:cantSplit/>
           <w:trHeight w:val="1174"/>
         </w:trPr>
         <w:tc>
@@ -5637,7 +5477,7 @@
                 <w:rFonts w:ascii="Cambria" w:eastAsia="Cambria" w:hAnsi="Cambria" w:cs="Cambria"/>
                 <w:b/>
                 <w:bCs/>
-                <w:color w:val="7030A0"/>
+                <w:color w:val="000000"/>
                 <w:u w:val="single"/>
                 <w:lang w:val="id-ID"/>
               </w:rPr>
@@ -5647,7 +5487,7 @@
                 <w:rFonts w:ascii="Cambria" w:eastAsia="Cambria" w:hAnsi="Cambria" w:cs="Cambria"/>
                 <w:b/>
                 <w:bCs/>
-                <w:color w:val="7030A0"/>
+                <w:color w:val="000000"/>
                 <w:u w:val="single"/>
                 <w:lang w:val="id-ID"/>
               </w:rPr>
@@ -5669,7 +5509,7 @@
                 <w:rFonts w:ascii="Cambria" w:eastAsia="Cambria" w:hAnsi="Cambria" w:cs="Cambria"/>
                 <w:b/>
                 <w:bCs/>
-                <w:color w:val="7030A0"/>
+                <w:color w:val="000000"/>
                 <w:lang w:val="id-ID"/>
               </w:rPr>
             </w:pPr>
@@ -5694,7 +5534,7 @@
                 <w:rFonts w:ascii="Cambria" w:eastAsia="Cambria" w:hAnsi="Cambria" w:cs="Cambria"/>
                 <w:b/>
                 <w:bCs/>
-                <w:color w:val="7030A0"/>
+                <w:color w:val="000000"/>
                 <w:u w:val="single"/>
                 <w:lang w:val="id-ID"/>
               </w:rPr>
@@ -5704,7 +5544,7 @@
                 <w:rFonts w:ascii="Cambria" w:eastAsia="Cambria" w:hAnsi="Cambria" w:cs="Cambria"/>
                 <w:b/>
                 <w:bCs/>
-                <w:color w:val="7030A0"/>
+                <w:color w:val="000000"/>
                 <w:u w:val="single"/>
                 <w:lang w:val="id-ID"/>
               </w:rPr>
@@ -5751,100 +5591,9 @@
       </w:tr>
     </w:tbl>
     <w:p>
-      <w:pPr>
-        <w:pBdr>
-          <w:top w:val="nil"/>
-          <w:left w:val="nil"/>
-          <w:bottom w:val="nil"/>
-          <w:right w:val="nil"/>
-          <w:between w:val="nil"/>
-        </w:pBdr>
-        <w:spacing w:after="0"/>
-        <w:rPr>
-          <w:rFonts w:ascii="Cambria" w:eastAsia="Cambria" w:hAnsi="Cambria" w:cs="Cambria"/>
-          <w:lang w:val="id-ID"/>
-        </w:rPr>
-      </w:pPr>
-    </w:p>
-    <w:p>
-      <w:pPr>
-        <w:pBdr>
-          <w:top w:val="nil"/>
-          <w:left w:val="nil"/>
-          <w:bottom w:val="nil"/>
-          <w:right w:val="nil"/>
-          <w:between w:val="nil"/>
-        </w:pBdr>
-        <w:spacing w:after="0"/>
-        <w:rPr>
-          <w:rFonts w:ascii="Cambria" w:eastAsia="Cambria" w:hAnsi="Cambria" w:cs="Cambria"/>
-          <w:lang w:val="id-ID"/>
-        </w:rPr>
-      </w:pPr>
-    </w:p>
-    <w:p>
-      <w:pPr>
-        <w:pBdr>
-          <w:top w:val="nil"/>
-          <w:left w:val="nil"/>
-          <w:bottom w:val="nil"/>
-          <w:right w:val="nil"/>
-          <w:between w:val="nil"/>
-        </w:pBdr>
-        <w:spacing w:after="0"/>
-        <w:rPr>
-          <w:rFonts w:ascii="Cambria" w:eastAsia="Cambria" w:hAnsi="Cambria" w:cs="Cambria"/>
-          <w:lang w:val="id-ID"/>
-        </w:rPr>
-      </w:pPr>
-    </w:p>
-    <w:p>
-      <w:pPr>
-        <w:pBdr>
-          <w:top w:val="nil"/>
-          <w:left w:val="nil"/>
-          <w:bottom w:val="nil"/>
-          <w:right w:val="nil"/>
-          <w:between w:val="nil"/>
-        </w:pBdr>
-        <w:spacing w:after="0"/>
-        <w:rPr>
-          <w:rFonts w:ascii="Cambria" w:eastAsia="Cambria" w:hAnsi="Cambria" w:cs="Cambria"/>
-          <w:lang w:val="id-ID"/>
-        </w:rPr>
-      </w:pPr>
-    </w:p>
-    <w:p>
-      <w:pPr>
-        <w:pBdr>
-          <w:top w:val="nil"/>
-          <w:left w:val="nil"/>
-          <w:bottom w:val="nil"/>
-          <w:right w:val="nil"/>
-          <w:between w:val="nil"/>
-        </w:pBdr>
-        <w:spacing w:after="0"/>
-        <w:rPr>
-          <w:rFonts w:ascii="Cambria" w:eastAsia="Cambria" w:hAnsi="Cambria" w:cs="Cambria"/>
-          <w:lang w:val="id-ID"/>
-        </w:rPr>
-      </w:pPr>
-    </w:p>
-    <w:p>
-      <w:pPr>
-        <w:pBdr>
-          <w:top w:val="nil"/>
-          <w:left w:val="nil"/>
-          <w:bottom w:val="nil"/>
-          <w:right w:val="nil"/>
-          <w:between w:val="nil"/>
-        </w:pBdr>
-        <w:spacing w:after="0"/>
-        <w:rPr>
-          <w:rFonts w:ascii="Cambria" w:eastAsia="Cambria" w:hAnsi="Cambria" w:cs="Cambria"/>
-          <w:lang w:val="id-ID"/>
-        </w:rPr>
-      </w:pPr>
+      <w:r>
+        <w:br w:type="page"/>
+      </w:r>
     </w:p>
     <w:p>
       <w:pPr>
@@ -5914,6 +5663,7 @@
     </w:p>
     <w:p>
       <w:pPr>
+        <w:keepNext/>
         <w:spacing w:after="0" w:line="259" w:lineRule="auto"/>
         <w:rPr>
           <w:rFonts w:ascii="Arial" w:eastAsia="Arial" w:hAnsi="Arial" w:cs="Arial"/>
@@ -5964,6 +5714,9 @@
         <w:gridCol w:w="4678"/>
       </w:tblGrid>
       <w:tr>
+        <w:trPr>
+          <w:cantSplit/>
+        </w:trPr>
         <w:tc>
           <w:tcPr>
             <w:tcW w:w="4815" w:type="dxa"/>
@@ -6141,6 +5894,7 @@
       </w:tr>
       <w:tr>
         <w:trPr>
+          <w:cantSplit/>
           <w:trHeight w:val="240"/>
         </w:trPr>
         <w:tc>

</xml_diff>

<commit_message>
Butir konsultasi Balai Jalan, unduhan untuk pemda, kop tanpa angka
Butir "Tidak melakukan perubahan tanpa melakukan konsultasi kepada Balai
Jalan dan PFID" masuk daftar baku kesimpulan, dan disisipkan lagi saat
berita acara lama disusun ulang supaya arsip yang sudah tergenerate ikut
memuatnya.

Pemda kini bisa mengunduh berkas Word daerahnya, tidak hanya melihat —
lewat kartu arsip maupun modal pratinjau. Unduhan tidak lagi memindahkan
isinya ke formulir, jadi berita acara yang sedang dikerjakan petugas PFID
tidak tertimpa.

Angka 51 dan 104 pada kotak logo kop surat dibuang dari template; dokumen
di arsip selalu dirender ulang, jadi yang lama pun ikut bersih.

Co-Authored-By: Claude Opus 5 <noreply@anthropic.com>
</commit_message>
<xml_diff>
--- a/assets/ba-template.docx
+++ b/assets/ba-template.docx
@@ -361,15 +361,6 @@
                                           <w:jc w:val="right"/>
                                           <w:textDirection w:val="btLr"/>
                                         </w:pPr>
-                                        <w:r>
-                                          <w:rPr>
-                                            <w:rFonts w:ascii="Arial" w:eastAsia="Arial" w:hAnsi="Arial" w:cs="Arial"/>
-                                            <w:b/>
-                                            <w:color w:val="000000"/>
-                                            <w:sz w:val="14"/>
-                                          </w:rPr>
-                                          <w:t>51</w:t>
-                                        </w:r>
                                       </w:p>
                                       <w:p>
                                         <w:pPr>
@@ -378,15 +369,6 @@
                                           <w:jc w:val="right"/>
                                           <w:textDirection w:val="btLr"/>
                                         </w:pPr>
-                                        <w:r>
-                                          <w:rPr>
-                                            <w:rFonts w:ascii="Arial" w:eastAsia="Arial" w:hAnsi="Arial" w:cs="Arial"/>
-                                            <w:b/>
-                                            <w:color w:val="000000"/>
-                                            <w:sz w:val="14"/>
-                                          </w:rPr>
-                                          <w:t>104</w:t>
-                                        </w:r>
                                       </w:p>
                                     </w:txbxContent>
                                   </wps:txbx>
@@ -652,15 +634,6 @@
                                     <w:jc w:val="right"/>
                                     <w:textDirection w:val="btLr"/>
                                   </w:pPr>
-                                  <w:r>
-                                    <w:rPr>
-                                      <w:rFonts w:ascii="Arial" w:eastAsia="Arial" w:hAnsi="Arial" w:cs="Arial"/>
-                                      <w:b/>
-                                      <w:color w:val="000000"/>
-                                      <w:sz w:val="14"/>
-                                    </w:rPr>
-                                    <w:t>51</w:t>
-                                  </w:r>
                                 </w:p>
                                 <w:p>
                                   <w:pPr>
@@ -669,15 +642,6 @@
                                     <w:jc w:val="right"/>
                                     <w:textDirection w:val="btLr"/>
                                   </w:pPr>
-                                  <w:r>
-                                    <w:rPr>
-                                      <w:rFonts w:ascii="Arial" w:eastAsia="Arial" w:hAnsi="Arial" w:cs="Arial"/>
-                                      <w:b/>
-                                      <w:color w:val="000000"/>
-                                      <w:sz w:val="14"/>
-                                    </w:rPr>
-                                    <w:t>104</w:t>
-                                  </w:r>
                                 </w:p>
                               </w:txbxContent>
                             </v:textbox>

</xml_diff>

<commit_message>
Butir konsultasi Balai Jalan jadi butir tebal terakhir di template
Butir itu semula ikut daftar yang bisa diketik, jadi letaknya bisa tertukar
dan tebalnya tidak sama dengan butir kelengkapan eMonitoring. Sekarang
paragrafnya tetap di template, persis di bawah butir eMonitoring, dengan
penomoran dan huruf tebal yang sama.

Butir yang sudah terlanjur tersimpan di arsip dibuang dari daftar yang bisa
diketik — perbandingannya longgar, jadi yang beda titik atau huruf besar pun
ikut terbuang — supaya tidak tercetak dua kali.

Co-Authored-By: Claude Opus 5 <noreply@anthropic.com>
</commit_message>
<xml_diff>
--- a/assets/ba-template.docx
+++ b/assets/ba-template.docx
@@ -5094,6 +5094,45 @@
           <w:lang w:val="id-ID"/>
         </w:rPr>
         <w:t>Kelengkapan dokumen di aplikasi eMonitoring DAK berpengaruh pada penilain kinerja daerah, untuk daerah diminta melengkapi sampai dengan batas waktu satu minggu kedepan.</w:t>
+      </w:r>
+    </w:p>
+    <w:p>
+      <w:pPr>
+        <w:numPr>
+          <w:ilvl w:val="1"/>
+          <w:numId w:val="2"/>
+        </w:numPr>
+        <w:pBdr>
+          <w:top w:val="nil"/>
+          <w:left w:val="nil"/>
+          <w:bottom w:val="nil"/>
+          <w:right w:val="nil"/>
+          <w:between w:val="nil"/>
+        </w:pBdr>
+        <w:spacing w:after="0" w:line="360" w:lineRule="auto"/>
+        <w:ind w:left="851"/>
+        <w:jc w:val="both"/>
+        <w:rPr>
+          <w:rFonts w:ascii="Cambria" w:eastAsia="Cambria" w:hAnsi="Cambria" w:cs="Cambria"/>
+          <w:b/>
+          <w:bCs/>
+          <w:color w:val="000000"/>
+          <w:sz w:val="24"/>
+          <w:szCs w:val="24"/>
+          <w:lang w:val="id-ID"/>
+        </w:rPr>
+      </w:pPr>
+      <w:r>
+        <w:rPr>
+          <w:rFonts w:ascii="Cambria" w:eastAsia="Cambria" w:hAnsi="Cambria" w:cs="Cambria"/>
+          <w:b/>
+          <w:bCs/>
+          <w:color w:val="000000"/>
+          <w:sz w:val="24"/>
+          <w:szCs w:val="24"/>
+          <w:lang w:val="id-ID"/>
+        </w:rPr>
+        <w:t xml:space="preserve">Tidak melakukan perubahan tanpa melakukan konsultasi kepada Balai Jalan dan PFID.</w:t>
       </w:r>
     </w:p>
     <w:p>

</xml_diff>